<commit_message>
Documentos: campos soltos tokenizados (combustível, horas extras, ocorrência, rescisão)
- termo-auxilio-combustivel: corrige o bug do modelo (faltava o DIA na data).
- autorizacao-horas-extras: Nome/Matrícula/Cargo/Setor viram campos (nome auto).
- relatorio-ocorrencia-ponto: Empregado/CPF viram campos (auto).
- comunicado-rescisao-antecipada: (.../.../....) vira campo de data de comparecimento.
Catálogo em sincronia. Fecha as 3 frentes — os documentos saem prontos do app.

Co-Authored-By: Claude Opus 4.8 <noreply@anthropic.com>
</commit_message>
<xml_diff>
--- a/api/_docrh/modelos/autorizacao-horas-extras.docx
+++ b/api/_docrh/modelos/autorizacao-horas-extras.docx
@@ -912,7 +912,7 @@
                 <w:iCs/>
                 <w:color w:val="000000" w:themeColor="text1"/>
               </w:rPr>
-              <w:t>e:</w:t>
+              <w:t>e: {{NOME_EMPREGADO}}</w:t>
             </w:r>
           </w:p>
         </w:tc>
@@ -997,7 +997,7 @@
                 <w:iCs/>
                 <w:color w:val="000000" w:themeColor="text1"/>
               </w:rPr>
-              <w:t>la:</w:t>
+              <w:t>la: {{MATRICULA}}</w:t>
             </w:r>
           </w:p>
         </w:tc>
@@ -1045,7 +1045,7 @@
                 <w:iCs/>
                 <w:color w:val="000000" w:themeColor="text1"/>
               </w:rPr>
-              <w:t>argo:</w:t>
+              <w:t>argo: {{CARGO_EMPREGADO}}</w:t>
             </w:r>
           </w:p>
         </w:tc>
@@ -1112,7 +1112,7 @@
                 <w:iCs/>
                 <w:color w:val="000000" w:themeColor="text1"/>
               </w:rPr>
-              <w:t>:</w:t>
+              <w:t>: {{SETOR}}</w:t>
             </w:r>
           </w:p>
         </w:tc>

</xml_diff>